<commit_message>
Solving Problem of Complete Binary Graph
</commit_message>
<xml_diff>
--- a/Week1/Basic_Pointers_Assignment[1].docx
+++ b/Week1/Basic_Pointers_Assignment[1].docx
@@ -1,6 +1,6 @@
 
 <file path=word/document.xml><?xml version="1.0" encoding="utf-8"?>
-<w:document xmlns:wpc="http://schemas.microsoft.com/office/word/2010/wordprocessingCanvas" xmlns:cx="http://schemas.microsoft.com/office/drawing/2014/chartex" xmlns:cx1="http://schemas.microsoft.com/office/drawing/2015/9/8/chartex" xmlns:cx2="http://schemas.microsoft.com/office/drawing/2015/10/21/chartex" xmlns:cx3="http://schemas.microsoft.com/office/drawing/2016/5/9/chartex" xmlns:cx4="http://schemas.microsoft.com/office/drawing/2016/5/10/chartex" xmlns:cx5="http://schemas.microsoft.com/office/drawing/2016/5/11/chartex" xmlns:cx6="http://schemas.microsoft.com/office/drawing/2016/5/12/chartex" xmlns:cx7="http://schemas.microsoft.com/office/drawing/2016/5/13/chartex" xmlns:cx8="http://schemas.microsoft.com/office/drawing/2016/5/14/chartex" xmlns:mc="http://schemas.openxmlformats.org/markup-compatibility/2006" xmlns:aink="http://schemas.microsoft.com/office/drawing/2016/ink" xmlns:am3d="http://schemas.microsoft.com/office/drawing/2017/model3d" xmlns:o="urn:schemas-microsoft-com:office:office" xmlns:r="http://schemas.openxmlformats.org/officeDocument/2006/relationships" xmlns:m="http://schemas.openxmlformats.org/officeDocument/2006/math" xmlns:v="urn:schemas-microsoft-com:vml" xmlns:wp14="http://schemas.microsoft.com/office/word/2010/wordprocessingDrawing" xmlns:wp="http://schemas.openxmlformats.org/drawingml/2006/wordprocessingDrawing" xmlns:w10="urn:schemas-microsoft-com:office:word" xmlns:w="http://schemas.openxmlformats.org/wordprocessingml/2006/main" xmlns:w14="http://schemas.microsoft.com/office/word/2010/wordml" xmlns:w15="http://schemas.microsoft.com/office/word/2012/wordml" xmlns:w16cid="http://schemas.microsoft.com/office/word/2016/wordml/cid" xmlns:w16se="http://schemas.microsoft.com/office/word/2015/wordml/symex" xmlns:wpg="http://schemas.microsoft.com/office/word/2010/wordprocessingGroup" xmlns:wpi="http://schemas.microsoft.com/office/word/2010/wordprocessingInk" xmlns:wne="http://schemas.microsoft.com/office/word/2006/wordml" xmlns:wps="http://schemas.microsoft.com/office/word/2010/wordprocessingShape" mc:Ignorable="w14 w15 w16se w16cid wp14">
+<w:document xmlns:wpc="http://schemas.microsoft.com/office/word/2010/wordprocessingCanvas" xmlns:cx="http://schemas.microsoft.com/office/drawing/2014/chartex" xmlns:cx1="http://schemas.microsoft.com/office/drawing/2015/9/8/chartex" xmlns:cx2="http://schemas.microsoft.com/office/drawing/2015/10/21/chartex" xmlns:cx3="http://schemas.microsoft.com/office/drawing/2016/5/9/chartex" xmlns:cx4="http://schemas.microsoft.com/office/drawing/2016/5/10/chartex" xmlns:cx5="http://schemas.microsoft.com/office/drawing/2016/5/11/chartex" xmlns:cx6="http://schemas.microsoft.com/office/drawing/2016/5/12/chartex" xmlns:cx7="http://schemas.microsoft.com/office/drawing/2016/5/13/chartex" xmlns:cx8="http://schemas.microsoft.com/office/drawing/2016/5/14/chartex" xmlns:mc="http://schemas.openxmlformats.org/markup-compatibility/2006" xmlns:aink="http://schemas.microsoft.com/office/drawing/2016/ink" xmlns:am3d="http://schemas.microsoft.com/office/drawing/2017/model3d" xmlns:o="urn:schemas-microsoft-com:office:office" xmlns:oel="http://schemas.microsoft.com/office/2019/extlst" xmlns:r="http://schemas.openxmlformats.org/officeDocument/2006/relationships" xmlns:m="http://schemas.openxmlformats.org/officeDocument/2006/math" xmlns:v="urn:schemas-microsoft-com:vml" xmlns:wp14="http://schemas.microsoft.com/office/word/2010/wordprocessingDrawing" xmlns:wp="http://schemas.openxmlformats.org/drawingml/2006/wordprocessingDrawing" xmlns:w10="urn:schemas-microsoft-com:office:word" xmlns:w="http://schemas.openxmlformats.org/wordprocessingml/2006/main" xmlns:w14="http://schemas.microsoft.com/office/word/2010/wordml" xmlns:w15="http://schemas.microsoft.com/office/word/2012/wordml" xmlns:w16cex="http://schemas.microsoft.com/office/word/2018/wordml/cex" xmlns:w16cid="http://schemas.microsoft.com/office/word/2016/wordml/cid" xmlns:w16="http://schemas.microsoft.com/office/word/2018/wordml" xmlns:w16sdtdh="http://schemas.microsoft.com/office/word/2020/wordml/sdtdatahash" xmlns:w16se="http://schemas.microsoft.com/office/word/2015/wordml/symex" xmlns:wpg="http://schemas.microsoft.com/office/word/2010/wordprocessingGroup" xmlns:wpi="http://schemas.microsoft.com/office/word/2010/wordprocessingInk" xmlns:wne="http://schemas.microsoft.com/office/word/2006/wordml" xmlns:wps="http://schemas.microsoft.com/office/word/2010/wordprocessingShape" mc:Ignorable="w14 w15 w16se w16cid w16 w16cex w16sdtdh wp14">
   <w:body>
     <w:p>
       <w:pPr>
@@ -389,7 +389,18 @@
         <w:t xml:space="preserve"> </w:t>
       </w:r>
       <w:r>
-        <w:t>Wild pointer</w:t>
+        <w:t>W</w:t>
+      </w:r>
+      <w:r>
+        <w:t xml:space="preserve"> </w:t>
+      </w:r>
+      <w:proofErr w:type="spellStart"/>
+      <w:r>
+        <w:t>ild</w:t>
+      </w:r>
+      <w:proofErr w:type="spellEnd"/>
+      <w:r>
+        <w:t xml:space="preserve"> pointer</w:t>
       </w:r>
     </w:p>
     <w:p>
@@ -1100,7 +1111,7 @@
           <w:kern w:val="0"/>
           <w:sz w:val="21"/>
           <w:szCs w:val="21"/>
-          <w:lang w:val="en-PK" w:eastAsia="en-PK"/>
+          <w:lang/>
           <w14:ligatures w14:val="none"/>
         </w:rPr>
       </w:pPr>
@@ -1111,7 +1122,7 @@
           <w:kern w:val="0"/>
           <w:sz w:val="21"/>
           <w:szCs w:val="21"/>
-          <w:lang w:val="en-PK" w:eastAsia="en-PK"/>
+          <w:lang/>
           <w14:ligatures w14:val="none"/>
         </w:rPr>
         <w:t>void</w:t>
@@ -1123,12 +1134,11 @@
           <w:kern w:val="0"/>
           <w:sz w:val="21"/>
           <w:szCs w:val="21"/>
-          <w:lang w:val="en-PK" w:eastAsia="en-PK"/>
+          <w:lang/>
           <w14:ligatures w14:val="none"/>
         </w:rPr>
         <w:t xml:space="preserve"> </w:t>
       </w:r>
-      <w:proofErr w:type="gramStart"/>
       <w:r>
         <w:rPr>
           <w:rFonts w:ascii="Consolas" w:eastAsia="Times New Roman" w:hAnsi="Consolas" w:cs="Times New Roman"/>
@@ -1136,7 +1146,7 @@
           <w:kern w:val="0"/>
           <w:sz w:val="21"/>
           <w:szCs w:val="21"/>
-          <w:lang w:val="en-PK" w:eastAsia="en-PK"/>
+          <w:lang/>
           <w14:ligatures w14:val="none"/>
         </w:rPr>
         <w:t>swap</w:t>
@@ -1148,12 +1158,11 @@
           <w:kern w:val="0"/>
           <w:sz w:val="21"/>
           <w:szCs w:val="21"/>
-          <w:lang w:val="en-PK" w:eastAsia="en-PK"/>
+          <w:lang/>
           <w14:ligatures w14:val="none"/>
         </w:rPr>
         <w:t>(</w:t>
       </w:r>
-      <w:proofErr w:type="gramEnd"/>
       <w:r>
         <w:rPr>
           <w:rFonts w:ascii="Consolas" w:eastAsia="Times New Roman" w:hAnsi="Consolas" w:cs="Times New Roman"/>
@@ -1161,7 +1170,7 @@
           <w:kern w:val="0"/>
           <w:sz w:val="21"/>
           <w:szCs w:val="21"/>
-          <w:lang w:val="en-PK" w:eastAsia="en-PK"/>
+          <w:lang/>
           <w14:ligatures w14:val="none"/>
         </w:rPr>
         <w:t>int</w:t>
@@ -1173,7 +1182,7 @@
           <w:kern w:val="0"/>
           <w:sz w:val="21"/>
           <w:szCs w:val="21"/>
-          <w:lang w:val="en-PK" w:eastAsia="en-PK"/>
+          <w:lang/>
           <w14:ligatures w14:val="none"/>
         </w:rPr>
         <w:t>*</w:t>
@@ -1185,7 +1194,7 @@
           <w:kern w:val="0"/>
           <w:sz w:val="21"/>
           <w:szCs w:val="21"/>
-          <w:lang w:val="en-PK" w:eastAsia="en-PK"/>
+          <w:lang/>
           <w14:ligatures w14:val="none"/>
         </w:rPr>
         <w:t xml:space="preserve"> </w:t>
@@ -1197,7 +1206,7 @@
           <w:kern w:val="0"/>
           <w:sz w:val="21"/>
           <w:szCs w:val="21"/>
-          <w:lang w:val="en-PK" w:eastAsia="en-PK"/>
+          <w:lang/>
           <w14:ligatures w14:val="none"/>
         </w:rPr>
         <w:t>a</w:t>
@@ -1209,7 +1218,7 @@
           <w:kern w:val="0"/>
           <w:sz w:val="21"/>
           <w:szCs w:val="21"/>
-          <w:lang w:val="en-PK" w:eastAsia="en-PK"/>
+          <w:lang/>
           <w14:ligatures w14:val="none"/>
         </w:rPr>
         <w:t xml:space="preserve">, </w:t>
@@ -1221,7 +1230,7 @@
           <w:kern w:val="0"/>
           <w:sz w:val="21"/>
           <w:szCs w:val="21"/>
-          <w:lang w:val="en-PK" w:eastAsia="en-PK"/>
+          <w:lang/>
           <w14:ligatures w14:val="none"/>
         </w:rPr>
         <w:t>int</w:t>
@@ -1233,7 +1242,7 @@
           <w:kern w:val="0"/>
           <w:sz w:val="21"/>
           <w:szCs w:val="21"/>
-          <w:lang w:val="en-PK" w:eastAsia="en-PK"/>
+          <w:lang/>
           <w14:ligatures w14:val="none"/>
         </w:rPr>
         <w:t>*</w:t>
@@ -1245,7 +1254,7 @@
           <w:kern w:val="0"/>
           <w:sz w:val="21"/>
           <w:szCs w:val="21"/>
-          <w:lang w:val="en-PK" w:eastAsia="en-PK"/>
+          <w:lang/>
           <w14:ligatures w14:val="none"/>
         </w:rPr>
         <w:t xml:space="preserve"> </w:t>
@@ -1257,7 +1266,7 @@
           <w:kern w:val="0"/>
           <w:sz w:val="21"/>
           <w:szCs w:val="21"/>
-          <w:lang w:val="en-PK" w:eastAsia="en-PK"/>
+          <w:lang/>
           <w14:ligatures w14:val="none"/>
         </w:rPr>
         <w:t>b</w:t>
@@ -1269,7 +1278,7 @@
           <w:kern w:val="0"/>
           <w:sz w:val="21"/>
           <w:szCs w:val="21"/>
-          <w:lang w:val="en-PK" w:eastAsia="en-PK"/>
+          <w:lang/>
           <w14:ligatures w14:val="none"/>
         </w:rPr>
         <w:t>) {</w:t>
@@ -1285,7 +1294,7 @@
           <w:kern w:val="0"/>
           <w:sz w:val="21"/>
           <w:szCs w:val="21"/>
-          <w:lang w:val="en-PK" w:eastAsia="en-PK"/>
+          <w:lang/>
           <w14:ligatures w14:val="none"/>
         </w:rPr>
       </w:pPr>
@@ -1296,7 +1305,7 @@
           <w:kern w:val="0"/>
           <w:sz w:val="21"/>
           <w:szCs w:val="21"/>
-          <w:lang w:val="en-PK" w:eastAsia="en-PK"/>
+          <w:lang/>
           <w14:ligatures w14:val="none"/>
         </w:rPr>
         <w:t>   </w:t>
@@ -1308,7 +1317,7 @@
           <w:kern w:val="0"/>
           <w:sz w:val="21"/>
           <w:szCs w:val="21"/>
-          <w:lang w:val="en-PK" w:eastAsia="en-PK"/>
+          <w:lang/>
           <w14:ligatures w14:val="none"/>
         </w:rPr>
         <w:t>int</w:t>
@@ -1320,7 +1329,7 @@
           <w:kern w:val="0"/>
           <w:sz w:val="21"/>
           <w:szCs w:val="21"/>
-          <w:lang w:eastAsia="en-PK"/>
+          <w:lang/>
           <w14:ligatures w14:val="none"/>
         </w:rPr>
         <w:t xml:space="preserve"> </w:t>
@@ -1332,7 +1341,7 @@
           <w:kern w:val="0"/>
           <w:sz w:val="21"/>
           <w:szCs w:val="21"/>
-          <w:lang w:val="en-PK" w:eastAsia="en-PK"/>
+          <w:lang/>
           <w14:ligatures w14:val="none"/>
         </w:rPr>
         <w:t>temp</w:t>
@@ -1344,7 +1353,7 @@
           <w:kern w:val="0"/>
           <w:sz w:val="21"/>
           <w:szCs w:val="21"/>
-          <w:lang w:val="en-PK" w:eastAsia="en-PK"/>
+          <w:lang/>
           <w14:ligatures w14:val="none"/>
         </w:rPr>
         <w:t xml:space="preserve"> </w:t>
@@ -1356,7 +1365,7 @@
           <w:kern w:val="0"/>
           <w:sz w:val="21"/>
           <w:szCs w:val="21"/>
-          <w:lang w:val="en-PK" w:eastAsia="en-PK"/>
+          <w:lang/>
           <w14:ligatures w14:val="none"/>
         </w:rPr>
         <w:t>=</w:t>
@@ -1368,7 +1377,7 @@
           <w:kern w:val="0"/>
           <w:sz w:val="21"/>
           <w:szCs w:val="21"/>
-          <w:lang w:val="en-PK" w:eastAsia="en-PK"/>
+          <w:lang/>
           <w14:ligatures w14:val="none"/>
         </w:rPr>
         <w:t xml:space="preserve"> </w:t>
@@ -1380,7 +1389,7 @@
           <w:kern w:val="0"/>
           <w:sz w:val="21"/>
           <w:szCs w:val="21"/>
-          <w:lang w:val="en-PK" w:eastAsia="en-PK"/>
+          <w:lang/>
           <w14:ligatures w14:val="none"/>
         </w:rPr>
         <w:t>*</w:t>
@@ -1392,7 +1401,7 @@
           <w:kern w:val="0"/>
           <w:sz w:val="21"/>
           <w:szCs w:val="21"/>
-          <w:lang w:val="en-PK" w:eastAsia="en-PK"/>
+          <w:lang/>
           <w14:ligatures w14:val="none"/>
         </w:rPr>
         <w:t>a</w:t>
@@ -1404,7 +1413,7 @@
           <w:kern w:val="0"/>
           <w:sz w:val="21"/>
           <w:szCs w:val="21"/>
-          <w:lang w:val="en-PK" w:eastAsia="en-PK"/>
+          <w:lang/>
           <w14:ligatures w14:val="none"/>
         </w:rPr>
         <w:t>;</w:t>
@@ -1420,7 +1429,7 @@
           <w:kern w:val="0"/>
           <w:sz w:val="21"/>
           <w:szCs w:val="21"/>
-          <w:lang w:val="en-PK" w:eastAsia="en-PK"/>
+          <w:lang/>
           <w14:ligatures w14:val="none"/>
         </w:rPr>
       </w:pPr>
@@ -1431,7 +1440,7 @@
           <w:kern w:val="0"/>
           <w:sz w:val="21"/>
           <w:szCs w:val="21"/>
-          <w:lang w:val="en-PK" w:eastAsia="en-PK"/>
+          <w:lang/>
           <w14:ligatures w14:val="none"/>
         </w:rPr>
         <w:t>   </w:t>
@@ -1443,7 +1452,7 @@
           <w:kern w:val="0"/>
           <w:sz w:val="21"/>
           <w:szCs w:val="21"/>
-          <w:lang w:val="en-PK" w:eastAsia="en-PK"/>
+          <w:lang/>
           <w14:ligatures w14:val="none"/>
         </w:rPr>
         <w:t>*</w:t>
@@ -1455,7 +1464,7 @@
           <w:kern w:val="0"/>
           <w:sz w:val="21"/>
           <w:szCs w:val="21"/>
-          <w:lang w:val="en-PK" w:eastAsia="en-PK"/>
+          <w:lang/>
           <w14:ligatures w14:val="none"/>
         </w:rPr>
         <w:t>a</w:t>
@@ -1467,7 +1476,7 @@
           <w:kern w:val="0"/>
           <w:sz w:val="21"/>
           <w:szCs w:val="21"/>
-          <w:lang w:val="en-PK" w:eastAsia="en-PK"/>
+          <w:lang/>
           <w14:ligatures w14:val="none"/>
         </w:rPr>
         <w:t xml:space="preserve"> </w:t>
@@ -1479,7 +1488,7 @@
           <w:kern w:val="0"/>
           <w:sz w:val="21"/>
           <w:szCs w:val="21"/>
-          <w:lang w:val="en-PK" w:eastAsia="en-PK"/>
+          <w:lang/>
           <w14:ligatures w14:val="none"/>
         </w:rPr>
         <w:t>=</w:t>
@@ -1491,7 +1500,7 @@
           <w:kern w:val="0"/>
           <w:sz w:val="21"/>
           <w:szCs w:val="21"/>
-          <w:lang w:val="en-PK" w:eastAsia="en-PK"/>
+          <w:lang/>
           <w14:ligatures w14:val="none"/>
         </w:rPr>
         <w:t xml:space="preserve"> </w:t>
@@ -1503,7 +1512,7 @@
           <w:kern w:val="0"/>
           <w:sz w:val="21"/>
           <w:szCs w:val="21"/>
-          <w:lang w:val="en-PK" w:eastAsia="en-PK"/>
+          <w:lang/>
           <w14:ligatures w14:val="none"/>
         </w:rPr>
         <w:t>*</w:t>
@@ -1515,7 +1524,7 @@
           <w:kern w:val="0"/>
           <w:sz w:val="21"/>
           <w:szCs w:val="21"/>
-          <w:lang w:val="en-PK" w:eastAsia="en-PK"/>
+          <w:lang/>
           <w14:ligatures w14:val="none"/>
         </w:rPr>
         <w:t>b</w:t>
@@ -1527,7 +1536,7 @@
           <w:kern w:val="0"/>
           <w:sz w:val="21"/>
           <w:szCs w:val="21"/>
-          <w:lang w:val="en-PK" w:eastAsia="en-PK"/>
+          <w:lang/>
           <w14:ligatures w14:val="none"/>
         </w:rPr>
         <w:t>;</w:t>
@@ -1543,7 +1552,7 @@
           <w:kern w:val="0"/>
           <w:sz w:val="21"/>
           <w:szCs w:val="21"/>
-          <w:lang w:val="en-PK" w:eastAsia="en-PK"/>
+          <w:lang/>
           <w14:ligatures w14:val="none"/>
         </w:rPr>
       </w:pPr>
@@ -1554,7 +1563,7 @@
           <w:kern w:val="0"/>
           <w:sz w:val="21"/>
           <w:szCs w:val="21"/>
-          <w:lang w:val="en-PK" w:eastAsia="en-PK"/>
+          <w:lang/>
           <w14:ligatures w14:val="none"/>
         </w:rPr>
         <w:t>   </w:t>
@@ -1566,7 +1575,7 @@
           <w:kern w:val="0"/>
           <w:sz w:val="21"/>
           <w:szCs w:val="21"/>
-          <w:lang w:val="en-PK" w:eastAsia="en-PK"/>
+          <w:lang/>
           <w14:ligatures w14:val="none"/>
         </w:rPr>
         <w:t>*</w:t>
@@ -1578,7 +1587,7 @@
           <w:kern w:val="0"/>
           <w:sz w:val="21"/>
           <w:szCs w:val="21"/>
-          <w:lang w:val="en-PK" w:eastAsia="en-PK"/>
+          <w:lang/>
           <w14:ligatures w14:val="none"/>
         </w:rPr>
         <w:t>b</w:t>
@@ -1590,7 +1599,7 @@
           <w:kern w:val="0"/>
           <w:sz w:val="21"/>
           <w:szCs w:val="21"/>
-          <w:lang w:val="en-PK" w:eastAsia="en-PK"/>
+          <w:lang/>
           <w14:ligatures w14:val="none"/>
         </w:rPr>
         <w:t xml:space="preserve"> </w:t>
@@ -1602,7 +1611,7 @@
           <w:kern w:val="0"/>
           <w:sz w:val="21"/>
           <w:szCs w:val="21"/>
-          <w:lang w:val="en-PK" w:eastAsia="en-PK"/>
+          <w:lang/>
           <w14:ligatures w14:val="none"/>
         </w:rPr>
         <w:t>=</w:t>
@@ -1614,7 +1623,7 @@
           <w:kern w:val="0"/>
           <w:sz w:val="21"/>
           <w:szCs w:val="21"/>
-          <w:lang w:val="en-PK" w:eastAsia="en-PK"/>
+          <w:lang/>
           <w14:ligatures w14:val="none"/>
         </w:rPr>
         <w:t xml:space="preserve"> </w:t>
@@ -1626,7 +1635,7 @@
           <w:kern w:val="0"/>
           <w:sz w:val="21"/>
           <w:szCs w:val="21"/>
-          <w:lang w:val="en-PK" w:eastAsia="en-PK"/>
+          <w:lang/>
           <w14:ligatures w14:val="none"/>
         </w:rPr>
         <w:t>temp</w:t>
@@ -1638,7 +1647,7 @@
           <w:kern w:val="0"/>
           <w:sz w:val="21"/>
           <w:szCs w:val="21"/>
-          <w:lang w:val="en-PK" w:eastAsia="en-PK"/>
+          <w:lang/>
           <w14:ligatures w14:val="none"/>
         </w:rPr>
         <w:t>;</w:t>
@@ -1654,7 +1663,7 @@
           <w:kern w:val="0"/>
           <w:sz w:val="21"/>
           <w:szCs w:val="21"/>
-          <w:lang w:val="en-PK" w:eastAsia="en-PK"/>
+          <w:lang/>
           <w14:ligatures w14:val="none"/>
         </w:rPr>
       </w:pPr>
@@ -1665,7 +1674,7 @@
           <w:kern w:val="0"/>
           <w:sz w:val="21"/>
           <w:szCs w:val="21"/>
-          <w:lang w:val="en-PK" w:eastAsia="en-PK"/>
+          <w:lang/>
           <w14:ligatures w14:val="none"/>
         </w:rPr>
         <w:t>}</w:t>
@@ -2337,7 +2346,15 @@
       <w:proofErr w:type="spellEnd"/>
       <w:proofErr w:type="gramEnd"/>
       <w:r>
-        <w:t xml:space="preserve"> Pointers which donot have any </w:t>
+        <w:t xml:space="preserve"> Pointers which </w:t>
+      </w:r>
+      <w:proofErr w:type="spellStart"/>
+      <w:r>
+        <w:t>donot</w:t>
+      </w:r>
+      <w:proofErr w:type="spellEnd"/>
+      <w:r>
+        <w:t xml:space="preserve"> have any </w:t>
       </w:r>
       <w:proofErr w:type="spellStart"/>
       <w:r>
@@ -2488,13 +2505,8 @@
         </w:numPr>
       </w:pPr>
       <w:r>
-        <w:t xml:space="preserve">Why are pointers important </w:t>
-      </w:r>
-      <w:proofErr w:type="gramStart"/>
-      <w:r>
-        <w:t>in:</w:t>
-      </w:r>
-      <w:proofErr w:type="gramEnd"/>
+        <w:t>Why are pointers important in:</w:t>
+      </w:r>
     </w:p>
     <w:p>
       <w:pPr>
@@ -6551,8 +6563,6 @@
           <w:numId w:val="18"/>
         </w:numPr>
       </w:pPr>
-      <w:bookmarkStart w:id="0" w:name="_GoBack"/>
-      <w:bookmarkEnd w:id="0"/>
       <w:r>
         <w:t>Parameters</w:t>
       </w:r>
@@ -8344,8 +8354,8 @@
         <w:tblLook w:val="04A0" w:firstRow="1" w:lastRow="0" w:firstColumn="1" w:lastColumn="0" w:noHBand="0" w:noVBand="1"/>
       </w:tblPr>
       <w:tblGrid>
-        <w:gridCol w:w="2686"/>
-        <w:gridCol w:w="1413"/>
+        <w:gridCol w:w="2819"/>
+        <w:gridCol w:w="1494"/>
       </w:tblGrid>
       <w:tr>
         <w:trPr>
@@ -9360,7 +9370,7 @@
 </file>
 
 <file path=word/numbering.xml><?xml version="1.0" encoding="utf-8"?>
-<w:numbering xmlns:wpc="http://schemas.microsoft.com/office/word/2010/wordprocessingCanvas" xmlns:cx="http://schemas.microsoft.com/office/drawing/2014/chartex" xmlns:cx1="http://schemas.microsoft.com/office/drawing/2015/9/8/chartex" xmlns:cx2="http://schemas.microsoft.com/office/drawing/2015/10/21/chartex" xmlns:cx3="http://schemas.microsoft.com/office/drawing/2016/5/9/chartex" xmlns:cx4="http://schemas.microsoft.com/office/drawing/2016/5/10/chartex" xmlns:cx5="http://schemas.microsoft.com/office/drawing/2016/5/11/chartex" xmlns:cx6="http://schemas.microsoft.com/office/drawing/2016/5/12/chartex" xmlns:cx7="http://schemas.microsoft.com/office/drawing/2016/5/13/chartex" xmlns:cx8="http://schemas.microsoft.com/office/drawing/2016/5/14/chartex" xmlns:mc="http://schemas.openxmlformats.org/markup-compatibility/2006" xmlns:aink="http://schemas.microsoft.com/office/drawing/2016/ink" xmlns:am3d="http://schemas.microsoft.com/office/drawing/2017/model3d" xmlns:o="urn:schemas-microsoft-com:office:office" xmlns:r="http://schemas.openxmlformats.org/officeDocument/2006/relationships" xmlns:m="http://schemas.openxmlformats.org/officeDocument/2006/math" xmlns:v="urn:schemas-microsoft-com:vml" xmlns:wp14="http://schemas.microsoft.com/office/word/2010/wordprocessingDrawing" xmlns:wp="http://schemas.openxmlformats.org/drawingml/2006/wordprocessingDrawing" xmlns:w10="urn:schemas-microsoft-com:office:word" xmlns:w="http://schemas.openxmlformats.org/wordprocessingml/2006/main" xmlns:w14="http://schemas.microsoft.com/office/word/2010/wordml" xmlns:w15="http://schemas.microsoft.com/office/word/2012/wordml" xmlns:w16cid="http://schemas.microsoft.com/office/word/2016/wordml/cid" xmlns:w16se="http://schemas.microsoft.com/office/word/2015/wordml/symex" xmlns:wpg="http://schemas.microsoft.com/office/word/2010/wordprocessingGroup" xmlns:wpi="http://schemas.microsoft.com/office/word/2010/wordprocessingInk" xmlns:wne="http://schemas.microsoft.com/office/word/2006/wordml" xmlns:wps="http://schemas.microsoft.com/office/word/2010/wordprocessingShape" mc:Ignorable="w14 w15 w16se w16cid wp14">
+<w:numbering xmlns:wpc="http://schemas.microsoft.com/office/word/2010/wordprocessingCanvas" xmlns:cx="http://schemas.microsoft.com/office/drawing/2014/chartex" xmlns:cx1="http://schemas.microsoft.com/office/drawing/2015/9/8/chartex" xmlns:cx2="http://schemas.microsoft.com/office/drawing/2015/10/21/chartex" xmlns:cx3="http://schemas.microsoft.com/office/drawing/2016/5/9/chartex" xmlns:cx4="http://schemas.microsoft.com/office/drawing/2016/5/10/chartex" xmlns:cx5="http://schemas.microsoft.com/office/drawing/2016/5/11/chartex" xmlns:cx6="http://schemas.microsoft.com/office/drawing/2016/5/12/chartex" xmlns:cx7="http://schemas.microsoft.com/office/drawing/2016/5/13/chartex" xmlns:cx8="http://schemas.microsoft.com/office/drawing/2016/5/14/chartex" xmlns:mc="http://schemas.openxmlformats.org/markup-compatibility/2006" xmlns:aink="http://schemas.microsoft.com/office/drawing/2016/ink" xmlns:am3d="http://schemas.microsoft.com/office/drawing/2017/model3d" xmlns:o="urn:schemas-microsoft-com:office:office" xmlns:oel="http://schemas.microsoft.com/office/2019/extlst" xmlns:r="http://schemas.openxmlformats.org/officeDocument/2006/relationships" xmlns:m="http://schemas.openxmlformats.org/officeDocument/2006/math" xmlns:v="urn:schemas-microsoft-com:vml" xmlns:wp14="http://schemas.microsoft.com/office/word/2010/wordprocessingDrawing" xmlns:wp="http://schemas.openxmlformats.org/drawingml/2006/wordprocessingDrawing" xmlns:w10="urn:schemas-microsoft-com:office:word" xmlns:w="http://schemas.openxmlformats.org/wordprocessingml/2006/main" xmlns:w14="http://schemas.microsoft.com/office/word/2010/wordml" xmlns:w15="http://schemas.microsoft.com/office/word/2012/wordml" xmlns:w16cex="http://schemas.microsoft.com/office/word/2018/wordml/cex" xmlns:w16cid="http://schemas.microsoft.com/office/word/2016/wordml/cid" xmlns:w16="http://schemas.microsoft.com/office/word/2018/wordml" xmlns:w16sdtdh="http://schemas.microsoft.com/office/word/2020/wordml/sdtdatahash" xmlns:w16se="http://schemas.microsoft.com/office/word/2015/wordml/symex" xmlns:wpg="http://schemas.microsoft.com/office/word/2010/wordprocessingGroup" xmlns:wpi="http://schemas.microsoft.com/office/word/2010/wordprocessingInk" xmlns:wne="http://schemas.microsoft.com/office/word/2006/wordml" xmlns:wps="http://schemas.microsoft.com/office/word/2010/wordprocessingShape" mc:Ignorable="w14 w15 w16se w16cid w16 w16cex w16sdtdh wp14">
   <w:abstractNum w:abstractNumId="0" w15:restartNumberingAfterBreak="0">
     <w:nsid w:val="00D50D84"/>
     <w:multiLevelType w:val="hybridMultilevel"/>
@@ -11848,61 +11858,61 @@
       </w:rPr>
     </w:lvl>
   </w:abstractNum>
-  <w:num w:numId="1">
+  <w:num w:numId="1" w16cid:durableId="1480730800">
     <w:abstractNumId w:val="1"/>
   </w:num>
-  <w:num w:numId="2">
+  <w:num w:numId="2" w16cid:durableId="756900206">
     <w:abstractNumId w:val="12"/>
   </w:num>
-  <w:num w:numId="3">
+  <w:num w:numId="3" w16cid:durableId="587035865">
     <w:abstractNumId w:val="11"/>
   </w:num>
-  <w:num w:numId="4">
+  <w:num w:numId="4" w16cid:durableId="689181400">
     <w:abstractNumId w:val="7"/>
   </w:num>
-  <w:num w:numId="5">
+  <w:num w:numId="5" w16cid:durableId="805052946">
     <w:abstractNumId w:val="16"/>
   </w:num>
-  <w:num w:numId="6">
+  <w:num w:numId="6" w16cid:durableId="466314102">
     <w:abstractNumId w:val="10"/>
   </w:num>
-  <w:num w:numId="7">
+  <w:num w:numId="7" w16cid:durableId="1671252960">
     <w:abstractNumId w:val="15"/>
   </w:num>
-  <w:num w:numId="8">
+  <w:num w:numId="8" w16cid:durableId="1309287192">
     <w:abstractNumId w:val="18"/>
   </w:num>
-  <w:num w:numId="9">
+  <w:num w:numId="9" w16cid:durableId="1054696099">
     <w:abstractNumId w:val="4"/>
   </w:num>
-  <w:num w:numId="10">
+  <w:num w:numId="10" w16cid:durableId="1939676453">
     <w:abstractNumId w:val="13"/>
   </w:num>
-  <w:num w:numId="11">
+  <w:num w:numId="11" w16cid:durableId="1814175707">
     <w:abstractNumId w:val="14"/>
   </w:num>
-  <w:num w:numId="12">
+  <w:num w:numId="12" w16cid:durableId="1399330278">
     <w:abstractNumId w:val="17"/>
   </w:num>
-  <w:num w:numId="13">
+  <w:num w:numId="13" w16cid:durableId="162474206">
     <w:abstractNumId w:val="3"/>
   </w:num>
-  <w:num w:numId="14">
+  <w:num w:numId="14" w16cid:durableId="467403680">
     <w:abstractNumId w:val="5"/>
   </w:num>
-  <w:num w:numId="15">
+  <w:num w:numId="15" w16cid:durableId="1829516759">
     <w:abstractNumId w:val="0"/>
   </w:num>
-  <w:num w:numId="16">
+  <w:num w:numId="16" w16cid:durableId="1709717002">
     <w:abstractNumId w:val="2"/>
   </w:num>
-  <w:num w:numId="17">
+  <w:num w:numId="17" w16cid:durableId="631794261">
     <w:abstractNumId w:val="8"/>
   </w:num>
-  <w:num w:numId="18">
+  <w:num w:numId="18" w16cid:durableId="819464343">
     <w:abstractNumId w:val="6"/>
   </w:num>
-  <w:num w:numId="19">
+  <w:num w:numId="19" w16cid:durableId="2144039493">
     <w:abstractNumId w:val="9"/>
   </w:num>
   <w:numIdMacAtCleanup w:val="19"/>
@@ -11910,7 +11920,7 @@
 </file>
 
 <file path=word/styles.xml><?xml version="1.0" encoding="utf-8"?>
-<w:styles xmlns:mc="http://schemas.openxmlformats.org/markup-compatibility/2006" xmlns:r="http://schemas.openxmlformats.org/officeDocument/2006/relationships" xmlns:w="http://schemas.openxmlformats.org/wordprocessingml/2006/main" xmlns:w14="http://schemas.microsoft.com/office/word/2010/wordml" xmlns:w15="http://schemas.microsoft.com/office/word/2012/wordml" xmlns:w16cid="http://schemas.microsoft.com/office/word/2016/wordml/cid" xmlns:w16se="http://schemas.microsoft.com/office/word/2015/wordml/symex" mc:Ignorable="w14 w15 w16se w16cid">
+<w:styles xmlns:mc="http://schemas.openxmlformats.org/markup-compatibility/2006" xmlns:r="http://schemas.openxmlformats.org/officeDocument/2006/relationships" xmlns:w="http://schemas.openxmlformats.org/wordprocessingml/2006/main" xmlns:w14="http://schemas.microsoft.com/office/word/2010/wordml" xmlns:w15="http://schemas.microsoft.com/office/word/2012/wordml" xmlns:w16cex="http://schemas.microsoft.com/office/word/2018/wordml/cex" xmlns:w16cid="http://schemas.microsoft.com/office/word/2016/wordml/cid" xmlns:w16="http://schemas.microsoft.com/office/word/2018/wordml" xmlns:w16sdtdh="http://schemas.microsoft.com/office/word/2020/wordml/sdtdatahash" xmlns:w16se="http://schemas.microsoft.com/office/word/2015/wordml/symex" mc:Ignorable="w14 w15 w16se w16cid w16 w16cex w16sdtdh">
   <w:docDefaults>
     <w:rPrDefault>
       <w:rPr>
@@ -11928,7 +11938,7 @@
       </w:pPr>
     </w:pPrDefault>
   </w:docDefaults>
-  <w:latentStyles w:defLockedState="0" w:defUIPriority="99" w:defSemiHidden="0" w:defUnhideWhenUsed="0" w:defQFormat="0" w:count="375">
+  <w:latentStyles w:defLockedState="0" w:defUIPriority="99" w:defSemiHidden="0" w:defUnhideWhenUsed="0" w:defQFormat="0" w:count="376">
     <w:lsdException w:name="Normal" w:uiPriority="0" w:qFormat="1"/>
     <w:lsdException w:name="heading 1" w:uiPriority="9" w:qFormat="1"/>
     <w:lsdException w:name="heading 2" w:semiHidden="1" w:uiPriority="9" w:unhideWhenUsed="1" w:qFormat="1"/>
@@ -12304,6 +12314,7 @@
     <w:lsdException w:name="Smart Hyperlink" w:semiHidden="1" w:unhideWhenUsed="1"/>
     <w:lsdException w:name="Hashtag" w:semiHidden="1" w:unhideWhenUsed="1"/>
     <w:lsdException w:name="Unresolved Mention" w:semiHidden="1" w:unhideWhenUsed="1"/>
+    <w:lsdException w:name="Smart Link" w:semiHidden="1" w:unhideWhenUsed="1"/>
   </w:latentStyles>
   <w:style w:type="paragraph" w:default="1" w:styleId="Normal">
     <w:name w:val="Normal"/>

</xml_diff>